<commit_message>
Godot Lesson 11 (partial), Lesson 10/11 updates, new book concept (AI Usage Case Study), Streaming standards
</commit_message>
<xml_diff>
--- a/docs/Book/Book_Notes_and_ToDo.docx
+++ b/docs/Book/Book_Notes_and_ToDo.docx
@@ -783,6 +783,156 @@
         <w:t xml:space="preserve">☐ </w:t>
       </w:r>
       <w:r>
+        <w:t xml:space="preserve">Reflex habits: testing, documentation and refactoring as things students do without thinking of them as separate tasks (Robert's goal, raised at the Lesson 11 review after his own GameMaker project drifted from the Keys): see the separate document Reflex_Habits_Design_Notes.docx (this folder). It holds Robert's problem statement, Claude's first-pass commentary (yes at beginner level if taught as three plain habits: try it, say it, tidy it, in the last five minutes of lab), a draft candidate Rule 16 (Done Means Tried, Named and Tidy), concrete mechanisms, options for fixing the instructor's own drift, a long spitballing list, risks, and the decisions needed. Nothing in it is adopted yet.</w:t>
+      </w:r>
+      <w:r>
+        <w:rPr>
+          <w:i/>
+          <w:iCs/>
+          <w:color w:val="777777"/>
+          <w:sz w:val="18"/>
+          <w:szCs w:val="18"/>
+        </w:rPr>
+        <w:t xml:space="preserve">  (raised by Robert at the Lesson 11 review; decision pending on candidate Rule 16)</w:t>
+      </w:r>
+    </w:p>
+    <w:p>
+      <w:pPr>
+        <w:pStyle w:val="ListParagraph"/>
+        <w:numPr>
+          <w:ilvl w:val="0"/>
+          <w:numId w:val="2"/>
+        </w:numPr>
+        <w:spacing w:after="80"/>
+      </w:pPr>
+      <w:r>
+        <w:rPr>
+          <w:b/>
+          <w:bCs/>
+        </w:rPr>
+        <w:t xml:space="preserve">☐ </w:t>
+      </w:r>
+      <w:r>
+        <w:t xml:space="preserve">Name the bug: "the Stalemate" (book edition, Robert's decision at the Lesson 11 review): refer to the win/lose gap bug by this name everywhere in the book and course materials from now on. Definition for the manuscript: a round that ends with no win, no loss and no restart, because escapes lower lives but never lower enemies_remaining. The name should appear the first time the bug is reported (Lesson 10's Level 3), be used in Lesson 11's wave discussion, and in any Semester 2 repeat of the bug-hunt exercise. The name also appears in Lesson 10 and Lesson 11 handouts and Teacher's Keys as of Lesson 11 (Lesson 10's own Level 3 text does not name it yet, only the Lesson 11 materials do; decide whether to add the name to Lesson 10's Level 3 in the book).</w:t>
+      </w:r>
+      <w:r>
+        <w:rPr>
+          <w:i/>
+          <w:iCs/>
+          <w:color w:val="777777"/>
+          <w:sz w:val="18"/>
+          <w:szCs w:val="18"/>
+        </w:rPr>
+        <w:t xml:space="preserve">  (decision at the Lesson 11 review; name adopted from Robert)</w:t>
+      </w:r>
+    </w:p>
+    <w:p>
+      <w:pPr>
+        <w:pStyle w:val="ListParagraph"/>
+        <w:numPr>
+          <w:ilvl w:val="0"/>
+          <w:numId w:val="2"/>
+        </w:numPr>
+        <w:spacing w:after="80"/>
+      </w:pPr>
+      <w:r>
+        <w:rPr>
+          <w:b/>
+          <w:bCs/>
+        </w:rPr>
+        <w:t xml:space="preserve">☐ </w:t>
+      </w:r>
+      <w:r>
+        <w:t xml:space="preserve">Lesson 11 compliance pass (done for active engines): Handouts and Keys for Scratch, Godot, GameMaker (script and Visual) and Unity were rewritten to match the Lesson 10 design: wave and total_waves live on the GameManager (Rule 13), the Lesson 10 spawn routine is reused as the 'spawn a wave' routine (spawn_enemies / SpawnEnemies, broadcast [spawn enemies]), complete highlighted Level 1 code (Rule 14), Key code for Levels 1 to 3 (Rule 14), Activity Diagram (new, diagram_activity_wave_flow) and a GameMaker Visual node diagram (Rule 9), game-state check for the new state, speaker notes copied verbatim from the Teacher's Script (Rule 8), Unity demo rewritten without the singleton (Rule 10). The Stalemate is deliberately left in for students to find and fix (Level 3), with a worked wave-aware fix in each Key. Paused engines (Unreal, 001 Game Creator, GDevelop, TIC-80, Unity Visual) were NOT rebuilt: their Lesson 11 files in the lesson folder are the old, stale versions (singleton, spawn_wave naming, no Rule 14 code) and must be rebuilt from the active-engine design during the book pass.</w:t>
+      </w:r>
+      <w:r>
+        <w:rPr>
+          <w:i/>
+          <w:iCs/>
+          <w:color w:val="777777"/>
+          <w:sz w:val="18"/>
+          <w:szCs w:val="18"/>
+        </w:rPr>
+        <w:t xml:space="preserve">  (Lesson 11 review, Rules 8, 9, 10, 11, 12, 13, 14, 15)</w:t>
+      </w:r>
+    </w:p>
+    <w:p>
+      <w:pPr>
+        <w:pStyle w:val="ListParagraph"/>
+        <w:numPr>
+          <w:ilvl w:val="0"/>
+          <w:numId w:val="2"/>
+        </w:numPr>
+        <w:spacing w:after="80"/>
+      </w:pPr>
+      <w:r>
+        <w:rPr>
+          <w:b/>
+          <w:bCs/>
+        </w:rPr>
+        <w:t xml:space="preserve">☐ </w:t>
+      </w:r>
+      <w:r>
+        <w:t xml:space="preserve">Unity static GameManager - concrete cost found in Lesson 11: because RegisterKill() is static, it cannot use the instance Spawner slot, so the wave request is passed through a static flag (nextWaveRequested) that GameManager's Update() acts on. It works and teaches 'static methods cannot reach instance members', but it is exactly the workaround the non-static redesign (see the static-members items above) would remove: with an instance GameManager, RegisterKill() would simply call spawner.SpawnEnemies(). Use this as the motivating example in the book's static-versus-instance discussion.</w:t>
+      </w:r>
+      <w:r>
+        <w:rPr>
+          <w:i/>
+          <w:iCs/>
+          <w:color w:val="777777"/>
+          <w:sz w:val="18"/>
+          <w:szCs w:val="18"/>
+        </w:rPr>
+        <w:t xml:space="preserve">  (found while rebuilding Lesson 11 Unity, Lesson 11 review)</w:t>
+      </w:r>
+    </w:p>
+    <w:p>
+      <w:pPr>
+        <w:pStyle w:val="ListParagraph"/>
+        <w:numPr>
+          <w:ilvl w:val="0"/>
+          <w:numId w:val="2"/>
+        </w:numPr>
+        <w:spacing w:after="80"/>
+      </w:pPr>
+      <w:r>
+        <w:rPr>
+          <w:b/>
+          <w:bCs/>
+        </w:rPr>
+        <w:t xml:space="preserve">☐ </w:t>
+      </w:r>
+      <w:r>
+        <w:t xml:space="preserve">Verify at the keyboard (Lesson 11, not tested by the author): (1) Godot: the next wave is requested with get_parent().call_deferred("spawn_enemies") because a wave clears inside a collision callback (suspected 'flushing queries' restriction on adding physics objects); confirm whether the deferral is actually required or merely harmless, and update the explanation accordingly. (2) GameMaker Visual: the Else block placement after a nested If Variable, and the Draw Value block's field labels, were written from the earlier Lesson 8 to 10 block names and have not been clicked through. (3) Scratch: confirm the last-hit clone never double-spawns a wave (it deletes itself before GameManager's broadcast arrives).</w:t>
+      </w:r>
+      <w:r>
+        <w:rPr>
+          <w:i/>
+          <w:iCs/>
+          <w:color w:val="777777"/>
+          <w:sz w:val="18"/>
+          <w:szCs w:val="18"/>
+        </w:rPr>
+        <w:t xml:space="preserve">  (Lesson 11 review, awaiting Robert's testing)</w:t>
+      </w:r>
+    </w:p>
+    <w:p>
+      <w:pPr>
+        <w:pStyle w:val="ListParagraph"/>
+        <w:numPr>
+          <w:ilvl w:val="0"/>
+          <w:numId w:val="2"/>
+        </w:numPr>
+        <w:spacing w:after="80"/>
+      </w:pPr>
+      <w:r>
+        <w:rPr>
+          <w:b/>
+          <w:bCs/>
+        </w:rPr>
+        <w:t xml:space="preserve">☐ </w:t>
+      </w:r>
+      <w:r>
         <w:t xml:space="preserve">GameMaker Prefabs: GameMaker has a Prefab concept. Unity introduces Prefabs in the course, so decide where and how GameMaker's equivalent is introduced (likely alongside the lesson where Unity first uses Prefabs), verify what GameMaker Prefabs actually are and how they differ, and update the cross-engine consistency reference and Data Dictionary accordingly.</w:t>
       </w:r>
       <w:r>
@@ -2042,7 +2192,7 @@
         <w:spacing w:after="160"/>
       </w:pPr>
       <w:r>
-        <w:t xml:space="preserve">First entry, written the same week as the Unreal Lesson 2/3/4/13 rebuild and the first pass of Cross_Engine_Consistency_Reference.docx. Updated the same week to add Standards Rule 6 (SuperStretch/Refinement and Style/visual-scripting reuse) and scope, but not begin, the question of retrofitting it into Lessons 1-15. Updated again to add Standards Rule 13 (dedicated manager object for shared state), the Lesson 6 GameManager retrofit, and Lesson 7's full compliance pass (GameManager routing, Rule 11 naming-drift fixes, the new Rule 9 diagram set, and Unity Visual Scripting prose tightening). Updated again to add a GameManager mini-lecture to Lesson 7's live slide deck (placed at the start of the lab section, separate from the main lecture) plus the paired ToDo to relocate that discussion to Lecture 06 once the book manuscript reaches it. Updated again to add Lesson 8's own full compliance pass (the lives/has_lost GameManager retrofit, Rule 11/12 TIC-80 and Scratch naming fixes, Rule 7 visual-path explicitness fixes, a new Rule 9 diagram set with a newly-documented Handout-vs-Key placement convention for the three dual-track engines, and the Rule 10/Rule 8 slide deck fixes correcting a Godot-leftover demo reference and adding its first six speaker-notes entries), and to narrow the Rule 7/8/9/13 retrofit ToDo items' remaining scope accordingly. Updated again to add Lesson 9's own full compliance pass (a four-engine Rule 13 GameManager retrofit for score - GameMaker, Scratch, Godot, and Unreal - plus a Rule 11/12 Scratch naming fix, a Rule 7 Unity Visual Scripting explicitness fix, a new Rule 9 diagram set reusing the established Handout-vs-Key placement convention, and the Rule 10/Rule 8 slide deck fixes correcting a Godot-leftover demo reference and adding its six speaker-notes entries), and to narrow the Rule 7/8/9/13 retrofit ToDo items' remaining scope to Lessons 10-15 accordingly. Updated again to record the GameMaker __dnd_lives/__dnd_score correction (Lessons 8-9) and five follow-up To-Do items (Lessons 10-15 review, obj.variable vs. Target drop-down, an If Lives comparison sidebar, GameMaker Prefabs, and dropping asset-name prefixes). Updated again to record the Unity static-members items, the cross-engine name normalization To-Do and the canonical bug-hunt decision, plus the Lesson 10 compliance pass and the cross-engine design-drift To-Do (HUD object, prefabs). Add to this document as the course continues; do a dedicated consolidation pass every so often rather than continuously.</w:t>
+        <w:t xml:space="preserve">First entry, written the same week as the Unreal Lesson 2/3/4/13 rebuild and the first pass of Cross_Engine_Consistency_Reference.docx. Updated the same week to add Standards Rule 6 (SuperStretch/Refinement and Style/visual-scripting reuse) and scope, but not begin, the question of retrofitting it into Lessons 1-15. Updated again to add Standards Rule 13 (dedicated manager object for shared state), the Lesson 6 GameManager retrofit, and Lesson 7's full compliance pass (GameManager routing, Rule 11 naming-drift fixes, the new Rule 9 diagram set, and Unity Visual Scripting prose tightening). Updated again to add a GameManager mini-lecture to Lesson 7's live slide deck (placed at the start of the lab section, separate from the main lecture) plus the paired ToDo to relocate that discussion to Lecture 06 once the book manuscript reaches it. Updated again to add Lesson 8's own full compliance pass (the lives/has_lost GameManager retrofit, Rule 11/12 TIC-80 and Scratch naming fixes, Rule 7 visual-path explicitness fixes, a new Rule 9 diagram set with a newly-documented Handout-vs-Key placement convention for the three dual-track engines, and the Rule 10/Rule 8 slide deck fixes correcting a Godot-leftover demo reference and adding its first six speaker-notes entries), and to narrow the Rule 7/8/9/13 retrofit ToDo items' remaining scope accordingly. Updated again to add Lesson 9's own full compliance pass (a four-engine Rule 13 GameManager retrofit for score - GameMaker, Scratch, Godot, and Unreal - plus a Rule 11/12 Scratch naming fix, a Rule 7 Unity Visual Scripting explicitness fix, a new Rule 9 diagram set reusing the established Handout-vs-Key placement convention, and the Rule 10/Rule 8 slide deck fixes correcting a Godot-leftover demo reference and adding its six speaker-notes entries), and to narrow the Rule 7/8/9/13 retrofit ToDo items' remaining scope to Lessons 10-15 accordingly. Updated again to record the GameMaker __dnd_lives/__dnd_score correction (Lessons 8-9) and five follow-up To-Do items (Lessons 10-15 review, obj.variable vs. Target drop-down, an If Lives comparison sidebar, GameMaker Prefabs, and dropping asset-name prefixes). Updated again to record the Unity static-members items, the cross-engine name normalization To-Do and the canonical bug-hunt decision, plus the Lesson 10 compliance pass and the cross-engine design-drift To-Do (HUD object, prefabs). Updated again at the Lesson 11 review to point to the new Reflex Habits design-notes document and to record the name "the Stalemate" for the win/lose gap bug and the Lesson 11 compliance pass (active engines only). Add to this document as the course continues; do a dedicated consolidation pass every so often rather than continuously.</w:t>
       </w:r>
     </w:p>
     <w:sectPr>

</xml_diff>

<commit_message>
Update to book related notes, including exported Claude conversations
</commit_message>
<xml_diff>
--- a/docs/Book/Book_Notes_and_ToDo.docx
+++ b/docs/Book/Book_Notes_and_ToDo.docx
@@ -1728,6 +1728,96 @@
     </w:p>
     <w:p>
       <w:pPr>
+        <w:pStyle w:val="ListParagraph"/>
+        <w:numPr>
+          <w:ilvl w:val="0"/>
+          <w:numId w:val="2"/>
+        </w:numPr>
+        <w:spacing w:after="80"/>
+      </w:pPr>
+      <w:r>
+        <w:rPr>
+          <w:b/>
+          <w:bCs/>
+        </w:rPr>
+        <w:t xml:space="preserve">☐ </w:t>
+      </w:r>
+      <w:r>
+        <w:t xml:space="preserve">New companion book/class concept, spitballed, not scoped or scheduled: "Debugging 101" - a course/book built around a pre-loaded code repository seeded with a variety of deliberately planted bugs, modeled directly on real categories this very project has hit: flat-out broken code that doesn't compile/run, failed edge cases, a new feature that breaks an existing one, a mismatch between the design doc and the actual code, a broken refactoring, and a misinterpreted feature (built to spec as written, but not to what was actually meant). Natural companion idea: "Testing 101" - the inverse situation, an existing codebase plus a design doc but NO test cases, where the student's job is to build the test suite from scratch. A possible third, combined course: "Testing/Debugging 201", merging both - use the act of writing test cases as the mechanism that both finds the bugs AND proves each fix actually worked (red test before the fix, green test after), rather than teaching testing and debugging as separate skills. All three are genuinely downstream of THIS project specifically: the bug categories map directly onto real bugs found while building this course (see the Notes &amp; Commentary entries on the spawn-loop self-collision bug, the GameMaker Visual targeting saga, the dropped Level 3 sounds, the WaveAnnouncementText/WaveText naming mismatch, and the Stalemate itself), which is exactly the kind of real-world-grounded material this idea would need. Not scoped, not scheduled, no engine/language/audience decided yet - purely a note-it-before-it's-lost entry; see the matching Notes &amp; Commentary entry for the fuller framing.</w:t>
+      </w:r>
+      <w:r>
+        <w:rPr>
+          <w:i/>
+          <w:iCs/>
+          <w:color w:val="777777"/>
+          <w:sz w:val="18"/>
+          <w:szCs w:val="18"/>
+        </w:rPr>
+        <w:t xml:space="preserve">  (Robert's idea, spitballed; companion concept to the main Video Game Creation course, not yet scoped)</w:t>
+      </w:r>
+    </w:p>
+    <w:p>
+      <w:pPr>
+        <w:pStyle w:val="ListParagraph"/>
+        <w:numPr>
+          <w:ilvl w:val="0"/>
+          <w:numId w:val="2"/>
+        </w:numPr>
+        <w:spacing w:after="80"/>
+      </w:pPr>
+      <w:r>
+        <w:rPr>
+          <w:b/>
+          <w:bCs/>
+        </w:rPr>
+        <w:t xml:space="preserve">☐ </w:t>
+      </w:r>
+      <w:r>
+        <w:t xml:space="preserve">GameMaker GML Visual audit: confirm whether any existing Visual-path content assumes an "Else If" node/block exists. It appears GML Visual has no such block - a three-or-more-way branch (if / else-if / else-if / else) has to be built by nesting a second If Variable (or equivalent) block inside the first one's Else slot, one level deeper each time, rather than chaining same-level blocks the way code's else if does. Any Handout, Key, or diagram instructing a student to "add an Else If block" in GML Visual is describing a block that may not exist and needs rewriting as nested If/Else instead; any node diagram showing a flat else-if chain for GameMaker Visual needs the same correction, drawn as actual nesting. Not yet audited against the shipped lessons - verify at the keyboard which lessons' GML Visual content has a 3-plus-way branch (Lessons 8-9's lives-vs-enemies-remaining check and Lesson 11's wave-cleared check are the most likely candidates) and confirm whether they already nest correctly or need fixing.</w:t>
+      </w:r>
+      <w:r>
+        <w:rPr>
+          <w:i/>
+          <w:iCs/>
+          <w:color w:val="777777"/>
+          <w:sz w:val="18"/>
+          <w:szCs w:val="18"/>
+        </w:rPr>
+        <w:t xml:space="preserve">  (raised by Robert; verify at the keyboard before concluding which lessons are affected)</w:t>
+      </w:r>
+    </w:p>
+    <w:p>
+      <w:pPr>
+        <w:pStyle w:val="ListParagraph"/>
+        <w:numPr>
+          <w:ilvl w:val="0"/>
+          <w:numId w:val="2"/>
+        </w:numPr>
+        <w:spacing w:after="80"/>
+      </w:pPr>
+      <w:r>
+        <w:rPr>
+          <w:b/>
+          <w:bCs/>
+        </w:rPr>
+        <w:t xml:space="preserve">☐ </w:t>
+      </w:r>
+      <w:r>
+        <w:t xml:space="preserve">Extend Standards Rule 12 (cross-engine consistency) to cover pop-up/overlay text presentation, not just variable and function naming: wave announcements, win/lose banners, and other HUD or momentary-message text should look as similar as reasonably possible from engine to engine - specifically including things like centering on screen, vertical placement, and text size, which the course has so far let drift silently (Robert's own words: "I've silently deviated on a few things like text placement, size, and such"). Proposed shape of the fix: define one simple, explicit set of reasonable defaults (e.g., centered horizontally, a consistent vertical band for a given message role, a consistent relative size for "HUD counter" text vs. "big announcement" text) and apply it as the baseline in every engine's Handout/Key, while still leaving room for a student to deviate on these small things if they want to. Robert's explicit design goal for how this should read in the lesson materials: it should take very little callout in the lesson plans themselves - the consistency should mostly just BE there, quietly, rather than being taught as its own topic - while still being fairly obvious to a student who looks at the actual steps what the convention is and why those particular values were chosen. A secondary benefit Robert flagged on purpose: nailing down one specific way to do a small, otherwise-you'd-have-to-look-it-up task (centering text on screen in each engine, for instance) functions as a tiny, free lesson in that engine's own text/UI API that the course doesn't have to spend any lecture time on, but that saves a student from going and searching for it themselves. Needs: an actual audit of every existing pop-up/HUD text element across the shipped lessons to find where defaults have already silently diverged, a decided set of default values per message role, and a lightweight way to state the convention in each engine's Setup/instructions without it reading as a big teaching moment.</w:t>
+      </w:r>
+      <w:r>
+        <w:rPr>
+          <w:i/>
+          <w:iCs/>
+          <w:color w:val="777777"/>
+          <w:sz w:val="18"/>
+          <w:szCs w:val="18"/>
+        </w:rPr>
+        <w:t xml:space="preserve">  (raised by Robert; extends Rule 12's existing scope from naming/structure to visual presentation of HUD/overlay text; not yet audited or decided)</w:t>
+      </w:r>
+    </w:p>
+    <w:p>
+      <w:pPr>
         <w:pStyle w:val="Heading1"/>
       </w:pPr>
       <w:r>
@@ -2181,6 +2271,44 @@
     </w:p>
     <w:p>
       <w:pPr>
+        <w:spacing w:after="200"/>
+      </w:pPr>
+      <w:r>
+        <w:rPr>
+          <w:b/>
+          <w:bCs/>
+          <w:color w:val="1C4A86"/>
+        </w:rPr>
+        <w:t xml:space="preserve">GML Visual has no Else If block - a genuine engine-specific gotcha, not yet retrofitted: </w:t>
+      </w:r>
+      <w:r>
+        <w:t xml:space="preserve">Robert's observation: GameMaker's GML Visual (drag-and-drop) toolbox appears to have no "Else If" node/block at all, unlike the code path's natural else if chain. The only way to express a third (or later) branch of a multi-way decision in Visual is to nest another If-style block one level deeper, inside the previous block's Else slot - so a three-way decision isn't three same-level blocks in a row, it's an If, whose Else contains another If, whose Else contains the final branch, and so on for each additional case. This is exactly the kind of engine-specific gotcha the project has already flagged as good troubleshooting-sidebar material elsewhere (see the earlier note on engine-specific gotchas as a candidate for a "common pitfalls" chapter): a student who's only ever written else if in text code will very reasonably go looking for an Else If block in GameMaker Visual, not find one, and assume the tool can't do what they want rather than realizing the shape is just different. Not yet checked against the shipped course content - see the matching To-Do item for which lessons (Lessons 8, 9, and 11 are the likely candidates, anywhere a lesson's logic needs to tell apart three or more outcomes - lives hitting zero vs. enemies hitting zero vs. neither, or a wave clearing vs. the whole round being won) actually have a three-or-more-way branch in their GML Visual content, and whether that content already nests correctly or was written as if a flat Else If existed.</w:t>
+      </w:r>
+      <w:r>
+        <w:t xml:space="preserve"/>
+      </w:r>
+    </w:p>
+    <w:p>
+      <w:pPr>
+        <w:spacing w:after="200"/>
+      </w:pPr>
+      <w:r>
+        <w:rPr>
+          <w:b/>
+          <w:bCs/>
+          <w:color w:val="1C4A86"/>
+        </w:rPr>
+        <w:t xml:space="preserve">Debugging 101 / Testing 101 / Testing-Debugging 201 - a companion course family, spitballed from this project's own bug history: </w:t>
+      </w:r>
+      <w:r>
+        <w:t xml:space="preserve">Robert's idea, raised as a sideways thought rather than a scoped proposal: a new book/class, "Debugging 101," built around a code repository pre-loaded with a variety of deliberately planted bugs for students to find and fix. The named bug categories he gave map with unusual precision onto bugs this very project actually produced and recorded: flat-out broken code that doesn't compile or run; a failed edge case (the Stalemate is exactly this - kills and escapes are each handled correctly in isolation, but the combination where some of each happen in one round was never considered); a new feature breaking an existing one (the dropped Level 3 sounds - a Rule 14 "complete method" regeneration for a later lesson silently deleted working Level 3 code from an earlier one); a mismatch between a design doc and the actual code (the WaveAnnouncementText/WaveText naming mismatch between a Handout's prose and its Teacher's Key); a broken refactoring (the GameMaker Visual targeting saga - a generic block was swapped for another generic block, then finally a purpose-built one, with two of the three attempts subtly wrong in a way only hands-on testing surfaced); and a misinterpreted feature (built to a literal reading of a spec, but not to what was actually intended - the enemy-vs-enemy self-collision bug is a plausible fit here too, where a generic "anything touched this" trigger was technically working as coded but not as meant). The parallel idea, "Testing 101": the inverse situation - an existing codebase plus a design doc, but no test suite at all, where the student's job is to write the tests. A possible synthesis, "Testing/Debugging 201": combine both so that writing a test case IS the mechanism that proves a fix actually worked, not just a separate skill taught alongside debugging - red test before the fix, green test after. None of this is scoped: no decision yet on audience (same Middle/High School homeschool audience as Video Game Creation, or a different one entirely), language/engine (the bug-category list reads as language-agnostic, but the actual repository would need a concrete stack), length (a standalone book, a short course, a unit folded into an existing one), or relationship to the main course (standalone companion vs. a Semester 2/Year 2 extension of Video Game Creation itself, given how directly its source material comes from this project). Recorded here purely so the idea isn't lost before it's had time to develop; revisit once Semester 1 of Video Game Creation is further along or complete.</w:t>
+      </w:r>
+      <w:r>
+        <w:t xml:space="preserve"/>
+      </w:r>
+    </w:p>
+    <w:p>
+      <w:pPr>
         <w:pStyle w:val="Heading1"/>
       </w:pPr>
       <w:r>
@@ -2192,12 +2320,12 @@
         <w:spacing w:after="160"/>
       </w:pPr>
       <w:r>
-        <w:t xml:space="preserve">First entry, written the same week as the Unreal Lesson 2/3/4/13 rebuild and the first pass of Cross_Engine_Consistency_Reference.docx. Updated the same week to add Standards Rule 6 (SuperStretch/Refinement and Style/visual-scripting reuse) and scope, but not begin, the question of retrofitting it into Lessons 1-15. Updated again to add Standards Rule 13 (dedicated manager object for shared state), the Lesson 6 GameManager retrofit, and Lesson 7's full compliance pass (GameManager routing, Rule 11 naming-drift fixes, the new Rule 9 diagram set, and Unity Visual Scripting prose tightening). Updated again to add a GameManager mini-lecture to Lesson 7's live slide deck (placed at the start of the lab section, separate from the main lecture) plus the paired ToDo to relocate that discussion to Lecture 06 once the book manuscript reaches it. Updated again to add Lesson 8's own full compliance pass (the lives/has_lost GameManager retrofit, Rule 11/12 TIC-80 and Scratch naming fixes, Rule 7 visual-path explicitness fixes, a new Rule 9 diagram set with a newly-documented Handout-vs-Key placement convention for the three dual-track engines, and the Rule 10/Rule 8 slide deck fixes correcting a Godot-leftover demo reference and adding its first six speaker-notes entries), and to narrow the Rule 7/8/9/13 retrofit ToDo items' remaining scope accordingly. Updated again to add Lesson 9's own full compliance pass (a four-engine Rule 13 GameManager retrofit for score - GameMaker, Scratch, Godot, and Unreal - plus a Rule 11/12 Scratch naming fix, a Rule 7 Unity Visual Scripting explicitness fix, a new Rule 9 diagram set reusing the established Handout-vs-Key placement convention, and the Rule 10/Rule 8 slide deck fixes correcting a Godot-leftover demo reference and adding its six speaker-notes entries), and to narrow the Rule 7/8/9/13 retrofit ToDo items' remaining scope to Lessons 10-15 accordingly. Updated again to record the GameMaker __dnd_lives/__dnd_score correction (Lessons 8-9) and five follow-up To-Do items (Lessons 10-15 review, obj.variable vs. Target drop-down, an If Lives comparison sidebar, GameMaker Prefabs, and dropping asset-name prefixes). Updated again to record the Unity static-members items, the cross-engine name normalization To-Do and the canonical bug-hunt decision, plus the Lesson 10 compliance pass and the cross-engine design-drift To-Do (HUD object, prefabs). Updated again at the Lesson 11 review to point to the new Reflex Habits design-notes document and to record the name "the Stalemate" for the win/lose gap bug and the Lesson 11 compliance pass (active engines only). Add to this document as the course continues; do a dedicated consolidation pass every so often rather than continuously.</w:t>
+        <w:t xml:space="preserve">First entry, written the same week as the Unreal Lesson 2/3/4/13 rebuild and the first pass of Cross_Engine_Consistency_Reference.docx. Updated the same week to add Standards Rule 6 (SuperStretch/Refinement and Style/visual-scripting reuse) and scope, but not begin, the question of retrofitting it into Lessons 1-15. Updated again to add Standards Rule 13 (dedicated manager object for shared state), the Lesson 6 GameManager retrofit, and Lesson 7's full compliance pass (GameManager routing, Rule 11 naming-drift fixes, the new Rule 9 diagram set, and Unity Visual Scripting prose tightening). Updated again to add a GameManager mini-lecture to Lesson 7's live slide deck (placed at the start of the lab section, separate from the main lecture) plus the paired ToDo to relocate that discussion to Lecture 06 once the book manuscript reaches it. Updated again to add Lesson 8's own full compliance pass (the lives/has_lost GameManager retrofit, Rule 11/12 TIC-80 and Scratch naming fixes, Rule 7 visual-path explicitness fixes, a new Rule 9 diagram set with a newly-documented Handout-vs-Key placement convention for the three dual-track engines, and the Rule 10/Rule 8 slide deck fixes correcting a Godot-leftover demo reference and adding its first six speaker-notes entries), and to narrow the Rule 7/8/9/13 retrofit ToDo items' remaining scope accordingly. Updated again to add Lesson 9's own full compliance pass (a four-engine Rule 13 GameManager retrofit for score - GameMaker, Scratch, Godot, and Unreal - plus a Rule 11/12 Scratch naming fix, a Rule 7 Unity Visual Scripting explicitness fix, a new Rule 9 diagram set reusing the established Handout-vs-Key placement convention, and the Rule 10/Rule 8 slide deck fixes correcting a Godot-leftover demo reference and adding its six speaker-notes entries), and to narrow the Rule 7/8/9/13 retrofit ToDo items' remaining scope to Lessons 10-15 accordingly. Updated again to record the GameMaker __dnd_lives/__dnd_score correction (Lessons 8-9) and five follow-up To-Do items (Lessons 10-15 review, obj.variable vs. Target drop-down, an If Lives comparison sidebar, GameMaker Prefabs, and dropping asset-name prefixes). Updated again to record the Unity static-members items, the cross-engine name normalization To-Do and the canonical bug-hunt decision, plus the Lesson 10 compliance pass and the cross-engine design-drift To-Do (HUD object, prefabs). Updated again at the Lesson 11 review to point to the new Reflex Habits design-notes document and to record the name "the Stalemate" for the win/lose gap bug and the Lesson 11 compliance pass (active engines only). Updated again to record a spitballed new companion course family - Debugging 101, Testing 101, and a combined Testing/Debugging 201 - raised by Robert as a sideways idea, not yet scoped. Updated again to record the GML Visual "no Else If block" gotcha (not yet audited against shipped content) and to extend Standards Rule 12's scope to cross-engine pop-up/HUD text presentation (centering, placement, size), with reasonable shared defaults proposed but not yet decided or audited. Add to this document as the course continues; do a dedicated consolidation pass every so often rather than continuously.</w:t>
       </w:r>
     </w:p>
     <w:sectPr>
-      <w:headerReference w:type="default" r:id="rId6"/>
-      <w:footerReference w:type="default" r:id="rId7"/>
+      <w:headerReference w:type="default" r:id="rId7"/>
+      <w:footerReference w:type="default" r:id="rId8"/>
       <w:pgSz w:w="12240" w:h="15840" w:orient="portrait"/>
       <w:pgMar w:top="1440" w:right="1440" w:bottom="1440" w:left="1440" w:header="708" w:footer="708" w:gutter="0"/>
       <w:pgNumType/>
@@ -2205,6 +2333,10 @@
     </w:sectPr>
   </w:body>
 </w:document>
+</file>
+
+<file path=word/comments.xml><?xml version="1.0" encoding="utf-8"?>
+<w:comments xmlns:cx="http://schemas.microsoft.com/office/drawing/2014/chartex" xmlns:cx1="http://schemas.microsoft.com/office/drawing/2015/9/8/chartex" xmlns:cx2="http://schemas.microsoft.com/office/drawing/2015/10/21/chartex" xmlns:cx3="http://schemas.microsoft.com/office/drawing/2016/5/9/chartex" xmlns:cx4="http://schemas.microsoft.com/office/drawing/2016/5/10/chartex" xmlns:cx5="http://schemas.microsoft.com/office/drawing/2016/5/11/chartex" xmlns:cx6="http://schemas.microsoft.com/office/drawing/2016/5/12/chartex" xmlns:cx7="http://schemas.microsoft.com/office/drawing/2016/5/13/chartex" xmlns:cx8="http://schemas.microsoft.com/office/drawing/2016/5/14/chartex" xmlns:mc="http://schemas.openxmlformats.org/markup-compatibility/2006" xmlns:aink="http://schemas.microsoft.com/office/drawing/2016/ink" xmlns:am3d="http://schemas.microsoft.com/office/drawing/2017/model3d" xmlns:o="urn:schemas-microsoft-com:office:office" xmlns:r="http://schemas.openxmlformats.org/officeDocument/2006/relationships" xmlns:m="http://schemas.openxmlformats.org/officeDocument/2006/math" xmlns:v="urn:schemas-microsoft-com:vml" xmlns:wp14="http://schemas.microsoft.com/office/word/2010/wordprocessingDrawing" xmlns:wp="http://schemas.openxmlformats.org/drawingml/2006/wordprocessingDrawing" xmlns:w10="urn:schemas-microsoft-com:office:word" xmlns:w="http://schemas.openxmlformats.org/wordprocessingml/2006/main" xmlns:w14="http://schemas.microsoft.com/office/word/2010/wordml" xmlns:w15="http://schemas.microsoft.com/office/word/2012/wordml" xmlns:w16cex="http://schemas.microsoft.com/office/word/2018/wordml/cex" xmlns:w16cid="http://schemas.microsoft.com/office/word/2016/wordml/cid" xmlns:w16="http://schemas.microsoft.com/office/word/2018/wordml" xmlns:w16sdtdh="http://schemas.microsoft.com/office/word/2020/wordml/sdtdatahash" xmlns:w16se="http://schemas.microsoft.com/office/word/2015/wordml/symex" xmlns:wpg="http://schemas.microsoft.com/office/word/2010/wordprocessingGroup" xmlns:wpi="http://schemas.microsoft.com/office/word/2010/wordprocessingInk" xmlns:wne="http://schemas.microsoft.com/office/word/2006/wordml" xmlns:wps="http://schemas.microsoft.com/office/word/2010/wordprocessingShape"/>
 </file>
 
 <file path=word/endnotes.xml><?xml version="1.0" encoding="utf-8"?>
@@ -2353,7 +2485,7 @@
 <w:numbering xmlns:wpc="http://schemas.microsoft.com/office/word/2010/wordprocessingCanvas" xmlns:mc="http://schemas.openxmlformats.org/markup-compatibility/2006" xmlns:o="urn:schemas-microsoft-com:office:office" xmlns:r="http://schemas.openxmlformats.org/officeDocument/2006/relationships" xmlns:m="http://schemas.openxmlformats.org/officeDocument/2006/math" xmlns:v="urn:schemas-microsoft-com:vml" xmlns:wp14="http://schemas.microsoft.com/office/word/2010/wordprocessingDrawing" xmlns:wp="http://schemas.openxmlformats.org/drawingml/2006/wordprocessingDrawing" xmlns:w10="urn:schemas-microsoft-com:office:word" xmlns:w="http://schemas.openxmlformats.org/wordprocessingml/2006/main" xmlns:w14="http://schemas.microsoft.com/office/word/2010/wordml" xmlns:w15="http://schemas.microsoft.com/office/word/2012/wordml" xmlns:wpg="http://schemas.microsoft.com/office/word/2010/wordprocessingGroup" xmlns:wpi="http://schemas.microsoft.com/office/word/2010/wordprocessingInk" xmlns:wne="http://schemas.microsoft.com/office/word/2006/wordml" xmlns:wps="http://schemas.microsoft.com/office/word/2010/wordprocessingShape" mc:Ignorable="w14 w15 wp14">
   <w:abstractNum w:abstractNumId="1" w15:restartNumberingAfterBreak="0">
     <w:multiLevelType w:val="hybridMultilevel"/>
-    <w:lvl w:ilvl="0" w:tentative="1">
+    <w:lvl w:ilvl="0" w15:tentative="1">
       <w:start w:val="1"/>
       <w:numFmt w:val="bullet"/>
       <w:lvlText w:val="●"/>
@@ -2362,7 +2494,7 @@
         <w:ind w:left="720" w:hanging="360"/>
       </w:pPr>
     </w:lvl>
-    <w:lvl w:ilvl="1" w:tentative="1">
+    <w:lvl w:ilvl="1" w15:tentative="1">
       <w:start w:val="1"/>
       <w:numFmt w:val="bullet"/>
       <w:lvlText w:val="○"/>
@@ -2371,7 +2503,7 @@
         <w:ind w:left="1440" w:hanging="360"/>
       </w:pPr>
     </w:lvl>
-    <w:lvl w:ilvl="2" w:tentative="1">
+    <w:lvl w:ilvl="2" w15:tentative="1">
       <w:start w:val="1"/>
       <w:numFmt w:val="bullet"/>
       <w:lvlText w:val="■"/>
@@ -2380,7 +2512,7 @@
         <w:ind w:left="2160" w:hanging="360"/>
       </w:pPr>
     </w:lvl>
-    <w:lvl w:ilvl="3" w:tentative="1">
+    <w:lvl w:ilvl="3" w15:tentative="1">
       <w:start w:val="1"/>
       <w:numFmt w:val="bullet"/>
       <w:lvlText w:val="●"/>
@@ -2389,7 +2521,7 @@
         <w:ind w:left="2880" w:hanging="360"/>
       </w:pPr>
     </w:lvl>
-    <w:lvl w:ilvl="4" w:tentative="1">
+    <w:lvl w:ilvl="4" w15:tentative="1">
       <w:start w:val="1"/>
       <w:numFmt w:val="bullet"/>
       <w:lvlText w:val="○"/>
@@ -2398,7 +2530,7 @@
         <w:ind w:left="3600" w:hanging="360"/>
       </w:pPr>
     </w:lvl>
-    <w:lvl w:ilvl="5" w:tentative="1">
+    <w:lvl w:ilvl="5" w15:tentative="1">
       <w:start w:val="1"/>
       <w:numFmt w:val="bullet"/>
       <w:lvlText w:val="■"/>
@@ -2407,7 +2539,7 @@
         <w:ind w:left="4320" w:hanging="360"/>
       </w:pPr>
     </w:lvl>
-    <w:lvl w:ilvl="6" w:tentative="1">
+    <w:lvl w:ilvl="6" w15:tentative="1">
       <w:start w:val="1"/>
       <w:numFmt w:val="bullet"/>
       <w:lvlText w:val="●"/>
@@ -2416,7 +2548,7 @@
         <w:ind w:left="5040" w:hanging="360"/>
       </w:pPr>
     </w:lvl>
-    <w:lvl w:ilvl="7" w:tentative="1">
+    <w:lvl w:ilvl="7" w15:tentative="1">
       <w:start w:val="1"/>
       <w:numFmt w:val="bullet"/>
       <w:lvlText w:val="●"/>
@@ -2425,7 +2557,7 @@
         <w:ind w:left="5760" w:hanging="360"/>
       </w:pPr>
     </w:lvl>
-    <w:lvl w:ilvl="8" w:tentative="1">
+    <w:lvl w:ilvl="8" w15:tentative="1">
       <w:start w:val="1"/>
       <w:numFmt w:val="bullet"/>
       <w:lvlText w:val="●"/>
@@ -2437,7 +2569,7 @@
   </w:abstractNum>
   <w:abstractNum w:abstractNumId="2" w15:restartNumberingAfterBreak="0">
     <w:multiLevelType w:val="hybridMultilevel"/>
-    <w:lvl w:ilvl="0" w:tentative="1">
+    <w:lvl w:ilvl="0" w15:tentative="1">
       <w:start w:val="1"/>
       <w:numFmt w:val="bullet"/>
       <w:lvlText w:val="•"/>
@@ -2449,7 +2581,7 @@
   </w:abstractNum>
   <w:abstractNum w:abstractNumId="3" w15:restartNumberingAfterBreak="0">
     <w:multiLevelType w:val="hybridMultilevel"/>
-    <w:lvl w:ilvl="0" w:tentative="1">
+    <w:lvl w:ilvl="0" w15:tentative="1">
       <w:start w:val="1"/>
       <w:numFmt w:val="decimal"/>
       <w:lvlText w:val="%1."/>
@@ -2486,25 +2618,6 @@
     </w:rPrDefault>
     <w:pPrDefault/>
   </w:docDefaults>
-  <w:style w:type="paragraph" w:styleId="Normal" w:default="1">
-    <w:name w:val="Normal"/>
-    <w:qFormat/>
-  </w:style>
-  <w:style w:type="table" w:styleId="TableNormal" w:default="true">
-    <w:name w:val="Normal Table"/>
-    <w:uiPriority w:val="99"/>
-    <w:semiHidden/>
-    <w:unhideWhenUsed/>
-    <w:tblPr>
-      <w:tblInd w:type="dxa" w:w="0"/>
-      <w:tblCellMar>
-        <w:top w:type="dxa" w:w="0"/>
-        <w:left w:type="dxa" w:w="108"/>
-        <w:bottom w:type="dxa" w:w="0"/>
-        <w:right w:type="dxa" w:w="108"/>
-      </w:tblCellMar>
-    </w:tblPr>
-  </w:style>
   <w:style w:type="paragraph" w:styleId="Title">
     <w:name w:val="Title"/>
     <w:basedOn w:val="Normal"/>
@@ -2513,6 +2626,39 @@
     <w:rPr>
       <w:sz w:val="56"/>
       <w:szCs w:val="56"/>
+    </w:rPr>
+  </w:style>
+  <w:style w:type="paragraph" w:styleId="Heading1">
+    <w:name w:val="Heading 1"/>
+    <w:basedOn w:val="Normal"/>
+    <w:next w:val="Normal"/>
+    <w:qFormat/>
+    <w:rPr>
+      <w:color w:val="2E74B5"/>
+      <w:sz w:val="32"/>
+      <w:szCs w:val="32"/>
+    </w:rPr>
+  </w:style>
+  <w:style w:type="paragraph" w:styleId="Heading2">
+    <w:name w:val="Heading 2"/>
+    <w:basedOn w:val="Normal"/>
+    <w:next w:val="Normal"/>
+    <w:qFormat/>
+    <w:rPr>
+      <w:color w:val="2E74B5"/>
+      <w:sz w:val="26"/>
+      <w:szCs w:val="26"/>
+    </w:rPr>
+  </w:style>
+  <w:style w:type="paragraph" w:styleId="Heading3">
+    <w:name w:val="Heading 3"/>
+    <w:basedOn w:val="Normal"/>
+    <w:next w:val="Normal"/>
+    <w:qFormat/>
+    <w:rPr>
+      <w:color w:val="1F4D78"/>
+      <w:sz w:val="24"/>
+      <w:szCs w:val="24"/>
     </w:rPr>
   </w:style>
   <w:style w:type="paragraph" w:styleId="Heading4">
@@ -2698,294 +2844,4 @@
     </w:rPr>
   </w:style>
 </w:styles>
-</file>
-
-<file path=word/theme/theme1.xml><?xml version="1.0" encoding="utf-8"?>
-<a:theme xmlns:a="http://schemas.openxmlformats.org/drawingml/2006/main" name="Office Theme">
-  <a:themeElements>
-    <a:clrScheme name="Office">
-      <a:dk1>
-        <a:sysClr val="windowText" lastClr="000000"/>
-      </a:dk1>
-      <a:lt1>
-        <a:sysClr val="window" lastClr="FFFFFF"/>
-      </a:lt1>
-      <a:dk2>
-        <a:srgbClr val="44546A"/>
-      </a:dk2>
-      <a:lt2>
-        <a:srgbClr val="E7E6E6"/>
-      </a:lt2>
-      <a:accent1>
-        <a:srgbClr val="4472C4"/>
-      </a:accent1>
-      <a:accent2>
-        <a:srgbClr val="ED7D31"/>
-      </a:accent2>
-      <a:accent3>
-        <a:srgbClr val="A5A5A5"/>
-      </a:accent3>
-      <a:accent4>
-        <a:srgbClr val="FFC000"/>
-      </a:accent4>
-      <a:accent5>
-        <a:srgbClr val="5B9BD5"/>
-      </a:accent5>
-      <a:accent6>
-        <a:srgbClr val="70AD47"/>
-      </a:accent6>
-      <a:hlink>
-        <a:srgbClr val="0563C1"/>
-      </a:hlink>
-      <a:folHlink>
-        <a:srgbClr val="954F72"/>
-      </a:folHlink>
-    </a:clrScheme>
-    <a:fontScheme name="Office">
-      <a:majorFont>
-        <a:latin typeface="Calibri Light" panose="020F0302020204030204"/>
-        <a:ea typeface=""/>
-        <a:cs typeface=""/>
-        <a:font script="Jpan" typeface="游ゴシック Light"/>
-        <a:font script="Hang" typeface="맑은 고딕"/>
-        <a:font script="Hans" typeface="等线 Light"/>
-        <a:font script="Hant" typeface="新細明體"/>
-        <a:font script="Arab" typeface="Times New Roman"/>
-        <a:font script="Hebr" typeface="Times New Roman"/>
-        <a:font script="Thai" typeface="Angsana New"/>
-        <a:font script="Ethi" typeface="Nyala"/>
-        <a:font script="Beng" typeface="Vrinda"/>
-        <a:font script="Gujr" typeface="Shruti"/>
-        <a:font script="Khmr" typeface="MoolBoran"/>
-        <a:font script="Knda" typeface="Tunga"/>
-        <a:font script="Guru" typeface="Raavi"/>
-        <a:font script="Cans" typeface="Euphemia"/>
-        <a:font script="Cher" typeface="Plantagenet Cherokee"/>
-        <a:font script="Yiii" typeface="Microsoft Yi Baiti"/>
-        <a:font script="Tibt" typeface="Microsoft Himalaya"/>
-        <a:font script="Thaa" typeface="MV Boli"/>
-        <a:font script="Deva" typeface="Mangal"/>
-        <a:font script="Telu" typeface="Gautami"/>
-        <a:font script="Taml" typeface="Latha"/>
-        <a:font script="Syrc" typeface="Estrangelo Edessa"/>
-        <a:font script="Orya" typeface="Kalinga"/>
-        <a:font script="Mlym" typeface="Kartika"/>
-        <a:font script="Laoo" typeface="DokChampa"/>
-        <a:font script="Sinh" typeface="Iskoola Pota"/>
-        <a:font script="Mong" typeface="Mongolian Baiti"/>
-        <a:font script="Viet" typeface="Times New Roman"/>
-        <a:font script="Uigh" typeface="Microsoft Uighur"/>
-        <a:font script="Geor" typeface="Sylfaen"/>
-        <a:font script="Armn" typeface="Arial"/>
-        <a:font script="Bugi" typeface="Leelawadee UI"/>
-        <a:font script="Bopo" typeface="Microsoft JhengHei"/>
-        <a:font script="Java" typeface="Javanese Text"/>
-        <a:font script="Lisu" typeface="Segoe UI"/>
-        <a:font script="Mymr" typeface="Myanmar Text"/>
-        <a:font script="Nkoo" typeface="Ebrima"/>
-        <a:font script="Olck" typeface="Nirmala UI"/>
-        <a:font script="Osma" typeface="Ebrima"/>
-        <a:font script="Phag" typeface="Phagspa"/>
-        <a:font script="Syrn" typeface="Estrangelo Edessa"/>
-        <a:font script="Syrj" typeface="Estrangelo Edessa"/>
-        <a:font script="Syre" typeface="Estrangelo Edessa"/>
-        <a:font script="Sora" typeface="Nirmala UI"/>
-        <a:font script="Tale" typeface="Microsoft Tai Le"/>
-        <a:font script="Talu" typeface="Microsoft New Tai Lue"/>
-        <a:font script="Tfng" typeface="Ebrima"/>
-      </a:majorFont>
-      <a:minorFont>
-        <a:latin typeface="Calibri" panose="020F0502020204030204"/>
-        <a:ea typeface=""/>
-        <a:cs typeface=""/>
-        <a:font script="Jpan" typeface="游明朝"/>
-        <a:font script="Hang" typeface="맑은 고딕"/>
-        <a:font script="Hans" typeface="等线"/>
-        <a:font script="Hant" typeface="新細明體"/>
-        <a:font script="Arab" typeface="Arial"/>
-        <a:font script="Hebr" typeface="Arial"/>
-        <a:font script="Thai" typeface="Cordia New"/>
-        <a:font script="Ethi" typeface="Nyala"/>
-        <a:font script="Beng" typeface="Vrinda"/>
-        <a:font script="Gujr" typeface="Shruti"/>
-        <a:font script="Khmr" typeface="DaunPenh"/>
-        <a:font script="Knda" typeface="Tunga"/>
-        <a:font script="Guru" typeface="Raavi"/>
-        <a:font script="Cans" typeface="Euphemia"/>
-        <a:font script="Cher" typeface="Plantagenet Cherokee"/>
-        <a:font script="Yiii" typeface="Microsoft Yi Baiti"/>
-        <a:font script="Tibt" typeface="Microsoft Himalaya"/>
-        <a:font script="Thaa" typeface="MV Boli"/>
-        <a:font script="Deva" typeface="Mangal"/>
-        <a:font script="Telu" typeface="Gautami"/>
-        <a:font script="Taml" typeface="Latha"/>
-        <a:font script="Syrc" typeface="Estrangelo Edessa"/>
-        <a:font script="Orya" typeface="Kalinga"/>
-        <a:font script="Mlym" typeface="Kartika"/>
-        <a:font script="Laoo" typeface="DokChampa"/>
-        <a:font script="Sinh" typeface="Iskoola Pota"/>
-        <a:font script="Mong" typeface="Mongolian Baiti"/>
-        <a:font script="Viet" typeface="Arial"/>
-        <a:font script="Uigh" typeface="Microsoft Uighur"/>
-        <a:font script="Geor" typeface="Sylfaen"/>
-        <a:font script="Armn" typeface="Arial"/>
-        <a:font script="Bugi" typeface="Leelawadee UI"/>
-        <a:font script="Bopo" typeface="Microsoft JhengHei"/>
-        <a:font script="Java" typeface="Javanese Text"/>
-        <a:font script="Lisu" typeface="Segoe UI"/>
-        <a:font script="Mymr" typeface="Myanmar Text"/>
-        <a:font script="Nkoo" typeface="Ebrima"/>
-        <a:font script="Olck" typeface="Nirmala UI"/>
-        <a:font script="Osma" typeface="Ebrima"/>
-        <a:font script="Phag" typeface="Phagspa"/>
-        <a:font script="Syrn" typeface="Estrangelo Edessa"/>
-        <a:font script="Syrj" typeface="Estrangelo Edessa"/>
-        <a:font script="Syre" typeface="Estrangelo Edessa"/>
-        <a:font script="Sora" typeface="Nirmala UI"/>
-        <a:font script="Tale" typeface="Microsoft Tai Le"/>
-        <a:font script="Talu" typeface="Microsoft New Tai Lue"/>
-        <a:font script="Tfng" typeface="Ebrima"/>
-      </a:minorFont>
-    </a:fontScheme>
-    <a:fmtScheme name="Office">
-      <a:fillStyleLst>
-        <a:solidFill>
-          <a:schemeClr val="phClr"/>
-        </a:solidFill>
-        <a:gradFill rotWithShape="true">
-          <a:gsLst>
-            <a:gs pos="0">
-              <a:schemeClr val="phClr">
-                <a:lumMod val="110000"/>
-                <a:satMod val="105000"/>
-                <a:tint val="67000"/>
-              </a:schemeClr>
-            </a:gs>
-            <a:gs pos="50000">
-              <a:schemeClr val="phClr">
-                <a:lumMod val="105000"/>
-                <a:satMod val="103000"/>
-                <a:tint val="73000"/>
-              </a:schemeClr>
-            </a:gs>
-            <a:gs pos="100000">
-              <a:schemeClr val="phClr">
-                <a:lumMod val="105000"/>
-                <a:satMod val="109000"/>
-                <a:tint val="81000"/>
-              </a:schemeClr>
-            </a:gs>
-          </a:gsLst>
-          <a:lin ang="5400000" scaled="false"/>
-        </a:gradFill>
-        <a:gradFill rotWithShape="true">
-          <a:gsLst>
-            <a:gs pos="0">
-              <a:schemeClr val="phClr">
-                <a:satMod val="103000"/>
-                <a:lumMod val="102000"/>
-                <a:tint val="94000"/>
-              </a:schemeClr>
-            </a:gs>
-            <a:gs pos="50000">
-              <a:schemeClr val="phClr">
-                <a:satMod val="110000"/>
-                <a:lumMod val="100000"/>
-                <a:shade val="100000"/>
-              </a:schemeClr>
-            </a:gs>
-            <a:gs pos="100000">
-              <a:schemeClr val="phClr">
-                <a:lumMod val="99000"/>
-                <a:satMod val="120000"/>
-                <a:shade val="78000"/>
-              </a:schemeClr>
-            </a:gs>
-          </a:gsLst>
-          <a:lin ang="5400000" scaled="false"/>
-        </a:gradFill>
-      </a:fillStyleLst>
-      <a:lnStyleLst>
-        <a:ln w="6350" cap="flat" cmpd="sng" algn="ctr">
-          <a:solidFill>
-            <a:schemeClr val="phClr"/>
-          </a:solidFill>
-          <a:prstDash val="solid"/>
-          <a:miter lim="800000"/>
-        </a:ln>
-        <a:ln w="12700" cap="flat" cmpd="sng" algn="ctr">
-          <a:solidFill>
-            <a:schemeClr val="phClr"/>
-          </a:solidFill>
-          <a:prstDash val="solid"/>
-          <a:miter lim="800000"/>
-        </a:ln>
-        <a:ln w="19050" cap="flat" cmpd="sng" algn="ctr">
-          <a:solidFill>
-            <a:schemeClr val="phClr"/>
-          </a:solidFill>
-          <a:prstDash val="solid"/>
-          <a:miter lim="800000"/>
-        </a:ln>
-      </a:lnStyleLst>
-      <a:effectStyleLst>
-        <a:effectStyle>
-          <a:effectLst/>
-        </a:effectStyle>
-        <a:effectStyle>
-          <a:effectLst/>
-        </a:effectStyle>
-        <a:effectStyle>
-          <a:effectLst>
-            <a:outerShdw blurRad="57150" dist="19050" dir="5400000" algn="ctr" rotWithShape="false">
-              <a:srgbClr val="000000">
-                <a:alpha val="63000"/>
-              </a:srgbClr>
-            </a:outerShdw>
-          </a:effectLst>
-        </a:effectStyle>
-      </a:effectStyleLst>
-      <a:bgFillStyleLst>
-        <a:solidFill>
-          <a:schemeClr val="phClr"/>
-        </a:solidFill>
-        <a:solidFill>
-          <a:schemeClr val="phClr">
-            <a:tint val="95000"/>
-            <a:satMod val="170000"/>
-          </a:schemeClr>
-        </a:solidFill>
-        <a:gradFill rotWithShape="true">
-          <a:gsLst>
-            <a:gs pos="0">
-              <a:schemeClr val="phClr">
-                <a:tint val="93000"/>
-                <a:satMod val="150000"/>
-                <a:shade val="98000"/>
-                <a:lumMod val="102000"/>
-              </a:schemeClr>
-            </a:gs>
-            <a:gs pos="50000">
-              <a:schemeClr val="phClr">
-                <a:tint val="98000"/>
-                <a:satMod val="130000"/>
-                <a:shade val="90000"/>
-                <a:lumMod val="103000"/>
-              </a:schemeClr>
-            </a:gs>
-            <a:gs pos="100000">
-              <a:schemeClr val="phClr">
-                <a:shade val="63000"/>
-                <a:satMod val="120000"/>
-              </a:schemeClr>
-            </a:gs>
-          </a:gsLst>
-          <a:lin ang="5400000" scaled="false"/>
-        </a:gradFill>
-      </a:bgFillStyleLst>
-    </a:fmtScheme>
-  </a:themeElements>
-  <a:objectDefaults/>
-  <a:extraClrSchemeLst/>
-</a:theme>
 </file>
</xml_diff>

<commit_message>
Validated Lesson 12 and massively refactored all currently used engines to revert my experimental code to canonical class code
</commit_message>
<xml_diff>
--- a/docs/Book/Book_Notes_and_ToDo.docx
+++ b/docs/Book/Book_Notes_and_ToDo.docx
@@ -303,17 +303,17 @@
         <w:t xml:space="preserve">☐ </w:t>
       </w:r>
       <w:r>
-        <w:t xml:space="preserve">Final deliverable for BOTH the course and the book: a Complete Script Document per engine and coding style - the entire finished Semester 1 project in one place (every object, script, event, function, graph, or block sequence in full, organized by object in build order, with the lesson that introduced each piece noted). Generate it from the same lesson build scripts so it cannot drift. Needed because lessons now show only the methods they add or modify (Standards Rule 14).</w:t>
-      </w:r>
-      <w:r>
-        <w:rPr>
-          <w:i/>
-          <w:iCs/>
-          <w:color w:val="777777"/>
-          <w:sz w:val="18"/>
-          <w:szCs w:val="18"/>
-        </w:rPr>
-        <w:t xml:space="preserve">  (decision by Robert; Standards doc now lists it as a Final Deliverable)</w:t>
+        <w:t xml:space="preserve">Final deliverable for BOTH the course and the book: a Complete Script Document per engine and coding style - the entire finished Semester 1 project in one place (every object, script, event, function, graph, or block sequence in full, organized by object in build order, with the lesson that introduced each piece noted). Generate it from the same lesson build scripts so it cannot drift. Needed because lessons now show only the methods they add or modify (Standards Rule 14). SCOPE NOW FINALIZED as a live-course Lesson 15 deliverable (see the dedicated ToDo item below for the full decision and its explicit dependency on reviewing the remaining lessons first) - this entry now serves mainly as the original decision record; see the newer entry for the actual build plan.</w:t>
+      </w:r>
+      <w:r>
+        <w:rPr>
+          <w:i/>
+          <w:iCs/>
+          <w:color w:val="777777"/>
+          <w:sz w:val="18"/>
+          <w:szCs w:val="18"/>
+        </w:rPr>
+        <w:t xml:space="preserve">  (decision by Robert; Standards doc now lists it as a Final Deliverable; superseded in scope by the Lesson 15 Complete Codebase ToDo below)</w:t>
       </w:r>
     </w:p>
     <w:p>
@@ -1818,6 +1818,216 @@
     </w:p>
     <w:p>
       <w:pPr>
+        <w:pStyle w:val="ListParagraph"/>
+        <w:numPr>
+          <w:ilvl w:val="0"/>
+          <w:numId w:val="2"/>
+        </w:numPr>
+        <w:spacing w:after="80"/>
+      </w:pPr>
+      <w:r>
+        <w:rPr>
+          <w:b/>
+          <w:bCs/>
+        </w:rPr>
+        <w:t xml:space="preserve">☐ </w:t>
+      </w:r>
+      <w:r>
+        <w:t xml:space="preserve">Book retrofit (Robert's decision, raised while reviewing Lesson 12): remove ALL sound assets and sound programming currently scattered as optional Level 3 ideas across the earlier lessons (the movement blip in Lesson 2, the shoot sound in Lesson 3, the hit/explosion sound in Lesson 4, the victory sound in Lesson 6, the life-lost/game-over sounds in Lesson 8), and reserve sound entirely for a dedicated Lesson 12 that teaches it properly as its own concept, not as a scattered series of optional add-ons. Robert may still choose to keep some of these as stretch/Level 3 goals in individual earlier lessons, but the explicit design intent either way is to make a conscious effort to "pull it all together" in Lesson 12 rather than let sound arrive piecemeal. This is a book-only retrofit - the live course's Lessons 2-11 already shipped with the scattered-optional-sound design and are not being changed retroactively; Lesson 12 itself was already corrected this session to assume every one of those sounds might be either freshly built or already present (see the Lesson 12 compliance pass note above), so the live course's actual Lesson 12 content does not need to change for this decision - only the earlier lessons' content would, in the book version. See the matching Notes &amp; Commentary entry for Robert's full reasoning and its connection to the Level 1/2/3 framework question also raised in this same message.</w:t>
+      </w:r>
+      <w:r>
+        <w:rPr>
+          <w:i/>
+          <w:iCs/>
+          <w:color w:val="777777"/>
+          <w:sz w:val="18"/>
+          <w:szCs w:val="18"/>
+        </w:rPr>
+        <w:t xml:space="preserve">  (Robert's decision, raised reviewing Lesson 12; book retrofit only, live course Lessons 2-11 unaffected)</w:t>
+      </w:r>
+    </w:p>
+    <w:p>
+      <w:pPr>
+        <w:pStyle w:val="ListParagraph"/>
+        <w:numPr>
+          <w:ilvl w:val="0"/>
+          <w:numId w:val="2"/>
+        </w:numPr>
+        <w:spacing w:after="80"/>
+      </w:pPr>
+      <w:r>
+        <w:rPr>
+          <w:b/>
+          <w:bCs/>
+        </w:rPr>
+        <w:t xml:space="preserve">☐ </w:t>
+      </w:r>
+      <w:r>
+        <w:t xml:space="preserve">Clarify and document the intended PURPOSE distinction between Level 1 and Level 2 across the whole course (Robert's framing, raised alongside the sound-consolidation decision above): Level 1 (Minimal/MVP) exists specifically so a classroom-paced student has a safety net - something they can reach quickly enough to not fall so far behind the live class cadence that they can no longer reasonably absorb the next lesson. Level 2 (Complete) is the actual PREFERRED accomplishment level, especially for self-paced/individual study, because it represents a more realistic, complete feature set and deliberately mixes "spoon-fed" instruction with "think on your own" challenge in a way Level 1 alone does not. This reframes Level 1 as a classroom-pacing safety valve rather than the course's real target, with Level 2 being the actual goal the course is designed around - worth stating explicitly in the book's framework chapter (see the existing "Level 1/2/3 framework as the book's spine" Notes &amp; Commentary entry) rather than leaving the Level 1 vs. Level 2 relationship implicit. A direct consequence for the sound-consolidation decision above: Robert is fairly sure Level 2 should NOT include sound effects once sound is consolidated into Lesson 12, since Level 2 is the realistic/preferred target students should reach across the earlier lessons, and sound doesn't belong there until its own dedicated lesson - not yet finalized, but stated as a strong leaning.</w:t>
+      </w:r>
+      <w:r>
+        <w:rPr>
+          <w:i/>
+          <w:iCs/>
+          <w:color w:val="777777"/>
+          <w:sz w:val="18"/>
+          <w:szCs w:val="18"/>
+        </w:rPr>
+        <w:t xml:space="preserve">  (Robert's framing, raised alongside the sound-consolidation decision; affects how Level 1/2/3 goals are worded across the book, not yet drafted)</w:t>
+      </w:r>
+    </w:p>
+    <w:p>
+      <w:pPr>
+        <w:pStyle w:val="ListParagraph"/>
+        <w:numPr>
+          <w:ilvl w:val="0"/>
+          <w:numId w:val="2"/>
+        </w:numPr>
+        <w:spacing w:after="80"/>
+      </w:pPr>
+      <w:r>
+        <w:rPr>
+          <w:b/>
+          <w:bCs/>
+        </w:rPr>
+        <w:t xml:space="preserve">☐ </w:t>
+      </w:r>
+      <w:r>
+        <w:t xml:space="preserve">Six candidate refactorings for the "Doing It the Doers of Stuff Way" final chapter (Robert, spotted while reconciling his own GameMaker Script project back into compliance with the shipped Lesson 12 code): (1) enemies_remaining should be incremented directly inside each enemy's own Create event rather than set via a fixed count inside the spawn loop that creates them - lets each enemy be self-reporting rather than relying on the spawner to know the total. (2) The number of enemies to spawn (currently a "mystery number" - 5 - hardcoded inside the spawn loop) should instead be a named variable (something like enemies_per_wave), so the value's meaning is visible at the point it's used, not just inferable from context. (3) enemies_remaining checks/decrements are currently scattered across multiple locations (obj_bullet's Collision event, obj_enemy's Step event, both now also routed through wave_cleared()) - Robert thinks most or all of this logic should consolidate onto a single, dedicated location: obj_enemy's own Destroy event, so that however an enemy goes away (hit or escape), the SAME one place is responsible for updating the count, rather than each removal path updating it independently. (4) The player-lives check (currently __dnd_lives, read/written from obj_enemy's Step event on an escape) arguably doesn't belong on obj_enemy at all - Robert leans toward it living on either obj_player or obj_gamemanager instead, since lives is fundamentally about the player/game state, not something the enemy itself should be reaching in to modify. (5) obj_player's Step event has accumulated enough logic over the semester (movement, firing, and whatever else has landed there) that moving movement specifically into its own separate script would reduce clutter and give Step a single, easier-to-scan responsibility. (6) obj_spawner's sole remaining job as of Lesson 10 is a single-line Create event (start_game();) - eventually that one call could move onto obj_gamemanager's own Create event instead, retiring obj_spawner as a distinct object entirely, since it no longer does anything a GameManager couldn't just as easily do for itself. Robert specifically noted that obj_spawner's own HISTORY across the course - starting as the object that owns the entire spawn loop (Lesson 5), shrinking to a single delegated function call once start_game() existed as its own Script resource (Lesson 10), and potentially being retired altogether as a final step - is itself a good, concrete, already-real example of incremental refactoring for the final chapter to walk through, not just the end-state change. None of these six are being implemented now - explicitly captured as raw material for the eventual dedicated refactoring-walkthrough chapter, where the WHY behind each one (self-reporting objects, named vs. magic numbers, single point of responsibility for a shared counter, state living on the object it actually belongs to, extracting a script to reduce event clutter, and retiring an object once its responsibilities have all been absorbed elsewhere) can get the full discussion Robert wants that chapter to have.</w:t>
+      </w:r>
+      <w:r>
+        <w:rPr>
+          <w:i/>
+          <w:iCs/>
+          <w:color w:val="777777"/>
+          <w:sz w:val="18"/>
+          <w:szCs w:val="18"/>
+        </w:rPr>
+        <w:t xml:space="preserve">  (Robert's own refactoring observations, raised while reconciling his GameMaker project; explicitly for the final refactoring chapter, not implemented now; item 6 doubles as a real example of incremental (not one-shot) refactoring)</w:t>
+      </w:r>
+    </w:p>
+    <w:p>
+      <w:pPr>
+        <w:pStyle w:val="ListParagraph"/>
+        <w:numPr>
+          <w:ilvl w:val="0"/>
+          <w:numId w:val="2"/>
+        </w:numPr>
+        <w:spacing w:after="80"/>
+      </w:pPr>
+      <w:r>
+        <w:rPr>
+          <w:b/>
+          <w:bCs/>
+        </w:rPr>
+        <w:t xml:space="preserve">☐ </w:t>
+      </w:r>
+      <w:r>
+        <w:t xml:space="preserve">GameMaker Lesson 12 sound calls given at the Level 1 architecture (inline win/wave-advance if/else in obj_bullet, direct spawn_enemies() call) may need reconciling against a project that's already past Level 1 - specifically, one that has the Lesson 10/11 Level 3 "Stalemate" fix in place (a shared wave_cleared() function, called from both obj_bullet's hit path and obj_enemy's escape path, so an escape can also clear a wave). If wave_cleared() already exists in a given project, Lesson 12's sfx_wave call belongs ONCE, inside wave_cleared()'s else branch, not duplicated/left inline in obj_bullet's Collision event. Raised while Robert was reconciling his own GameMaker Script project (which has deviated furthest from the shipped course materials of any engine) against the corrected Lesson 12 Key. Explicit decision: do NOT retrofit this now, in either the live course's shipped Lesson 12 materials or Robert's own test project. Leave it be, and handle it one of two ways later - either as an explicit refactor if a later lesson's own progression genuinely requires the wave_cleared() consolidation to exist by that point, or fold it into the planned "Doing It the Doers of Stuff Way" final refactoring chapter as a worked example (a shared-function extraction prompted by a second call site appearing, which is a very natural refactoring story to walk through).</w:t>
+      </w:r>
+      <w:r>
+        <w:rPr>
+          <w:i/>
+          <w:iCs/>
+          <w:color w:val="777777"/>
+          <w:sz w:val="18"/>
+          <w:szCs w:val="18"/>
+        </w:rPr>
+        <w:t xml:space="preserve">  (raised while Robert reconciled his own drifted GameMaker project against the Lesson 12 Key; explicitly not retrofitted now)</w:t>
+      </w:r>
+    </w:p>
+    <w:p>
+      <w:pPr>
+        <w:pStyle w:val="ListParagraph"/>
+        <w:numPr>
+          <w:ilvl w:val="0"/>
+          <w:numId w:val="2"/>
+        </w:numPr>
+        <w:spacing w:after="80"/>
+      </w:pPr>
+      <w:r>
+        <w:rPr>
+          <w:b/>
+          <w:bCs/>
+        </w:rPr>
+        <w:t xml:space="preserve">☐ </w:t>
+      </w:r>
+      <w:r>
+        <w:t xml:space="preserve">NEW Lesson 15 deliverable, fully scoped and decided (Robert), but explicitly DEFERRED - do not start building yet: a "Complete Codebase" document per engine, handed to students at Lesson 15 so they can check their own work over the semester break and come back ready for Semester 2. Scope, as decided: (1) Engines - the active 5 (Scratch, Godot, Unity C#, GameMaker Code, and GameMaker Visual), matching the existing active-engine-scope decision; the 4 paused engines (GDevelop, TIC-80, 001 Game Creator, Unreal) are explicitly out of scope for this deliverable. (2) Depth - NOT just the reliable Level 1/2 baseline; Level 3 "complete code" should be included wherever it exists, which means first BACKFILLING the known gap where several lessons' Keys only describe Level 3 in talking-point prose rather than full code (see the Rule 14 retrofit ToDo item), rather than skipping those lessons' Level 3 content. Robert's explicit reasoning for choosing the harder option: doing that backfill work now feeds forward into the book version too, so it isn't wasted effort scoped only to this one deliverable. (3) GameMaker Visual - represented as full node-flow diagrams per object, not prose description, extending the existing wireframe-diagram pilot (Lessons 5/7/8/9/11) to cover every GameMaker Visual object/script in the finished project completely, end to end. CRITICALLY: Robert explicitly said NOT to start this now - wait until the remaining lessons (through at least Lesson 15) have been reviewed first, because building this deliverable before that review is likely wasted effort (the reviewed lessons may still change, which would mean redoing the Complete Codebase work). Treat this as a planned, fully-scoped future task, not a current one - revisit once the remaining-lessons review is done.</w:t>
+      </w:r>
+      <w:r>
+        <w:rPr>
+          <w:i/>
+          <w:iCs/>
+          <w:color w:val="777777"/>
+          <w:sz w:val="18"/>
+          <w:szCs w:val="18"/>
+        </w:rPr>
+        <w:t xml:space="preserve">  (Robert's decision, fully scoped; explicitly deferred until the remaining lessons are reviewed - do not start early)</w:t>
+      </w:r>
+    </w:p>
+    <w:p>
+      <w:pPr>
+        <w:pStyle w:val="ListParagraph"/>
+        <w:numPr>
+          <w:ilvl w:val="0"/>
+          <w:numId w:val="2"/>
+        </w:numPr>
+        <w:spacing w:after="80"/>
+      </w:pPr>
+      <w:r>
+        <w:rPr>
+          <w:b/>
+          <w:bCs/>
+        </w:rPr>
+        <w:t xml:space="preserve">☐ </w:t>
+      </w:r>
+      <w:r>
+        <w:t xml:space="preserve">GameMaker naming inconsistency found and fixed: the drag-and-drop sound-playing block is called "Play Audio" (confirmed by Robert directly against his own installed GameMaker version). Several shipped Lessons (8, 10, 11, and the newly-added Lesson 12 content) had instead called it "Play Sound" or "Audio Play Sound" - genuine naming drift, not a deliberate choice. Fixed across build_lesson08/10/11/12_handouts_keys_checklist.js, build_lesson12_plan_teacher_script.js, and build_lesson12_slides_deck.js; rebuilt, PDF-verified (grep confirmed "Play Audio" present, no stale text remaining), and shipped to the Lesson 8/10/11/12 folders. Lesson 13's similar-looking "Play Sound"/"Play Sound 2D" references were checked and confirmed to belong to 001 Game Creator and Unreal Blueprint respectively - different engines' real terminology, correctly left untouched.</w:t>
+      </w:r>
+      <w:r>
+        <w:rPr>
+          <w:i/>
+          <w:iCs/>
+          <w:color w:val="777777"/>
+          <w:sz w:val="18"/>
+          <w:szCs w:val="18"/>
+        </w:rPr>
+        <w:t xml:space="preserve">  (Robert confirmed the correct block name at the keyboard; fix completed and shipped this session)</w:t>
+      </w:r>
+    </w:p>
+    <w:p>
+      <w:pPr>
+        <w:pStyle w:val="ListParagraph"/>
+        <w:numPr>
+          <w:ilvl w:val="0"/>
+          <w:numId w:val="2"/>
+        </w:numPr>
+        <w:spacing w:after="80"/>
+      </w:pPr>
+      <w:r>
+        <w:rPr>
+          <w:b/>
+          <w:bCs/>
+        </w:rPr>
+        <w:t xml:space="preserve">☐ </w:t>
+      </w:r>
+      <w:r>
+        <w:t xml:space="preserve">Book-only final chapter, decided (Robert): "Doing It the Doers of Stuff Way" - a dedicated, one-time refactoring walkthrough, taking the capstone's finished Semester 1 project and refactoring it end to end with full discussion of why and how, introducing Robert's own particular coding style and opinions explicitly as HIS style, not as a new ongoing requirement. This explicitly REPLACES an earlier, now-abandoned idea of a standing "Level 4" (refactoring + personal style, applied lesson by lesson alongside Levels 1-3 the same way Level 3/stretch goals and Sidebars already are). Robert's stated reason for rejecting the ongoing-Level-4 approach: it would force a choice between two bad options every single lesson going forward - either make refactoring-to-Robert's-style a mandatory part of every lesson (which he does not want), or maintain two parallel code paths per lesson (the plain Level 3 solution AND a separately-maintained "Refactored Level 3" solution) - and this project has already directly experienced how costly maintaining two divergent code paths for the same lesson can be (see the Script/Visual parity cleanup ToDo item and GameMaker's Code-vs-Visual drift problem elsewhere in this document) - a second one, chasing a moving personal-style target lesson by lesson, is explicitly something he does not want repeated. Instead, this becomes a single dedicated final chapter/lecture, intended to fall OUTSIDE the 30-lesson cadence entirely - delivered as a final micro-lecture, something students take home at the end of the course to study and experiment with on their own, explicitly framed as an invitation for students to develop their OWN opinions, form, and style rather than simply inheriting Robert's. Not yet scoped: which specific refactorings to walk through, how long the micro-lecture runs, or whether it's written as a live-delivered lecture, a stand-alone reading, or both.</w:t>
+      </w:r>
+      <w:r>
+        <w:rPr>
+          <w:i/>
+          <w:iCs/>
+          <w:color w:val="777777"/>
+          <w:sz w:val="18"/>
+          <w:szCs w:val="18"/>
+        </w:rPr>
+        <w:t xml:space="preserve">  (Robert's decision, supersedes the earlier unscoped Level 4/refactoring idea; book-only, falls outside the 30-lesson structure)</w:t>
+      </w:r>
+    </w:p>
+    <w:p>
+      <w:pPr>
         <w:pStyle w:val="Heading1"/>
       </w:pPr>
       <w:r>
@@ -2309,6 +2519,120 @@
     </w:p>
     <w:p>
       <w:pPr>
+        <w:spacing w:after="200"/>
+      </w:pPr>
+      <w:r>
+        <w:rPr>
+          <w:b/>
+          <w:bCs/>
+          <w:color w:val="1C4A86"/>
+        </w:rPr>
+        <w:t xml:space="preserve">Lesson 12 compliance pass: a real cross-engine sound-architecture conflict, resolved in favor of Option 1: </w:t>
+      </w:r>
+      <w:r>
+        <w:t xml:space="preserve">Auditing Lesson 12's shipped materials (requested by Robert before review) surfaced a genuine design-decision conflict, not just a drift-style bug like Lessons 7-9's compliance passes found. The Handouts/Keys had Godot and Unity building a brand-new shared sound player this lesson - Godot's RoundSound AudioStreamPlayer2D swapping its .stream property between three clips, Unity's roundAudioSrc AudioSource with a brand-new GameManager.instance singleton calling PlayOneShot() - while Scratch and GameMaker simply added more one-shot sound calls to existing branches, no shared player at all. This wasn't a copy-paste typo: it directly contradicted the dedicated-per-event sound pattern Lessons 6 and 8 had already established and shipped in every engine (WinSound/LifeLostSound/GameOverSound as separate AudioStreamPlayer2D nodes in Godot; winSound/lifeLostSound/gameOverSound as separate Inspector-assigned AudioClip fields reached through the already-existing GameManager.instance in Unity). The Lesson 12 content also introduced a brand-new sfx_lose.wav asset, when sfx_gameover.wav already existed and served the identical game-over moment since Lesson 8 - an unnecessary and unexplained new asset, not a case where two legitimately different sounds were needed. Rather than resolve this unilaterally, Robert was asked directly: Option 1 was to retire the shared-player design and the new sfx_lose asset, folding Lesson 12's wave-clear sound into the existing per-event pattern (one more dedicated node/field, reusing sfx_gameover.wav for game-over exactly as Lesson 8 built it); Option 2 was to keep the shared-player design and treat it as this lesson's deliberate new teaching point (a legitimate, if different, architecture worth knowing), fixing only the naming/wrong-asset issues. Robert chose Option 1 for the live course - see the separate note below for Option 2's preserved reasoning for the book version. All four active engines' (Scratch, Godot, Unity, GameMaker) and all four paused engines' (GDevelop, TIC-80, 001 Game Creator, Unreal) Handouts and Keys were rewritten under Option 1: one new dedicated sound per engine for the wave-clear event (Godot's WaveSound node, Unity's waveClip field, GameMaker/Scratch/the rest's one new sfx_wave call), and sfx_gameover (and, where applicable, sfx_lifelost) made mandatory rather than optional, reusing the Lesson 8 assets rather than sfx_lose. The Prep Checklist, GDD sound-asset description, Plan, and Teacher's Script were all corrected to match (the Teacher's Script's featured-engine demo narrative, built entirely around the old shared-player idea, needed a full rewrite of its 0:15-0:35 segment). The Slide Deck's zero existing speaker notes (a separate Rule 8 gap, unrelated to the sound-architecture question) were filled in across all eight content slides while the deck was already being rebuilt for the wording fixes. The old Assets/sfx_lose.wav file in the Lesson 12 folder is now unused under Option 1 but was left in place rather than deleted unilaterally - flagged to Robert as an open cleanup decision.</w:t>
+      </w:r>
+      <w:r>
+        <w:t xml:space="preserve"/>
+      </w:r>
+    </w:p>
+    <w:p>
+      <w:pPr>
+        <w:spacing w:after="200"/>
+      </w:pPr>
+      <w:r>
+        <w:rPr>
+          <w:b/>
+          <w:bCs/>
+          <w:color w:val="1C4A86"/>
+        </w:rPr>
+        <w:t xml:space="preserve">Sound should have been its own dedicated lesson all along - a retrofit decision, and a sharper Level 1/Level 2 framing it surfaced: </w:t>
+      </w:r>
+      <w:r>
+        <w:t xml:space="preserve">While getting ready to start on the just-fixed Lesson 12 materials, Robert had a realization he wished he'd had much earlier: Lesson 12 - "Hearing It Happen" - is fundamentally a dedicated sound lesson, and in hindsight the course would have been better served treating sound as a genuine, deliberately-scoped topic from the start, rather than scattering it as a series of small optional Level 3 'add a sound' stretch ideas across Lessons 2, 3, 4, 6, and 8 the way it actually happened. His stated regret, in his own words: introducing sound piecemeal in the earlier lessons 'was a mistake.' His proposed fix for the book version: strip the sound-related optional Level 3 content out of those earlier lessons entirely, and let Lesson 12 be where sound is taught properly, as its own concept with real attention - not as a backlog of previously-half-built features finally getting formalized, which is closer to what the live course's current Lesson 12 does. He left the door open to keeping some sound ideas as earlier-lesson stretch goals if that still makes sense on reflection, but the explicit design principle either way is to make Lesson 12 a genuine 'pull it all together' moment rather than a cleanup lesson. Importantly, this is scoped as book-only: the live course's Lessons 2-11 keep their existing optional-sound Level 3 content as shipped, and this session's Lesson 12 fix (reusing Lesson 6/8's established sounds and adding one new wave-clear cue) remains exactly right for the live course regardless of what the book eventually does differently in the earlier lessons.</w:t>
+      </w:r>
+      <w:r>
+        <w:t xml:space="preserve"/>
+      </w:r>
+    </w:p>
+    <w:p>
+      <w:pPr>
+        <w:spacing w:after="200"/>
+      </w:pPr>
+      <w:r>
+        <w:rPr>
+          <w:b/>
+          <w:bCs/>
+          <w:color w:val="1C4A86"/>
+        </w:rPr>
+        <w:t xml:space="preserve">A sharper Level 1 vs. Level 2 framing, surfaced by the same conversation: </w:t>
+      </w:r>
+      <w:r>
+        <w:t xml:space="preserve">Thinking through why scattering sound across early lessons felt wrong in hindsight led Robert to a broader, genuinely useful clarification of what Level 1 and Level 2 are actually FOR across the whole course - distinct from the existing 'Level 1/2/3 framework as the book's spine' note above, which covers the fractal MVP/Complete/Refined structure itself but doesn't address why a student would prefer one level over another. Robert's framing: Level 1 (Minimal/MVP) is specifically a classroom-pacing safety valve - its job is to give a student falling behind a fast, reachable floor so they don't fall so far behind the live class's cadence that they can no longer reasonably absorb the NEXT lesson, not to represent the course's actual intended destination for that week. Level 2 (Complete) is the real preferred target, especially for a self-paced or individually-studying reader (exactly the audience the book serves) - it's a more realistic, complete feature set, and it deliberately blends 'spoon-fed' instruction with 'figure it out yourself' challenge in a way Level 1 alone doesn't attempt to. This directly shapes the sound-consolidation decision above: Robert is fairly sure Level 2 goals should NOT include sound in the earlier lessons once sound is pulled out and consolidated into Lesson 12, since Level 2 is meant to be the realistic, preferred accomplishment for those lessons, and sound doesn't belong in that target picture until its own dedicated lesson actually earns it. Worth writing this Level 1-versus-Level 2 purpose distinction into the book's framework chapter explicitly, rather than leaving a reader to infer it from the numbering alone.</w:t>
+      </w:r>
+      <w:r>
+        <w:t xml:space="preserve"/>
+      </w:r>
+    </w:p>
+    <w:p>
+      <w:pPr>
+        <w:spacing w:after="200"/>
+      </w:pPr>
+      <w:r>
+        <w:rPr>
+          <w:b/>
+          <w:bCs/>
+          <w:color w:val="1C4A86"/>
+        </w:rPr>
+        <w:t xml:space="preserve">Lesson 15 Complete Codebase deliverable - scoped now, deliberately not built yet: </w:t>
+      </w:r>
+      <w:r>
+        <w:t xml:space="preserve">Robert asked for a new Lesson 15 deliverable: a complete, finished codebase per engine (at least the active engines), handed to students at the end of Semester 1 so they have something concrete to check their own work against over the break and come back ready for Semester 2 - distinct from, but a direct realization of, the already-logged "Complete Script Document" Final Deliverable idea. He also raised a second, related complaint while discussing it: GameMaker Visual's node-based logic has been represented as prose description throughout this course so far ("I don't feel like a textual description has been the best approach"), and asked for an actually diagrammatic representation instead. Three scoping questions were asked and answered directly: engines (the active 5: Scratch, Godot, Unity C#, GameMaker Code, GameMaker Visual - the 4 paused engines excluded), depth (Level 3 complete code included wherever it exists, which means backfilling the known Rule 14 Level-3-prose-only gap first rather than settling for the Level 1/2 baseline - chosen specifically because that backfill work also feeds the book), and GML Visual representation (full node-flow diagrams per object, extending the existing Lesson 5/7/8/9/11 wireframe-diagram pilot to cover every object completely, not selective/trivial-skipped). The one firm instruction layered on top of all three answers: don't start building this yet. Robert was explicit that doing it now, before the remaining lessons have been reviewed, would likely be wasted effort - the reviewed lessons could still change in ways that would require redoing the Complete Codebase work. Recorded here as a fully-scoped, ready-to-execute future task, deliberately not started.</w:t>
+      </w:r>
+      <w:r>
+        <w:t xml:space="preserve"/>
+      </w:r>
+    </w:p>
+    <w:p>
+      <w:pPr>
+        <w:spacing w:after="200"/>
+      </w:pPr>
+      <w:r>
+        <w:rPr>
+          <w:b/>
+          <w:bCs/>
+          <w:color w:val="1C4A86"/>
+        </w:rPr>
+        <w:t xml:space="preserve">"Doing It the Doers of Stuff Way" - why an ongoing Level 4 was abandoned in favor of one final chapter: </w:t>
+      </w:r>
+      <w:r>
+        <w:t xml:space="preserve">Robert originally envisioned a fourth tier alongside Level 1/2/3, stretch goals, and Sidebars: something focused on refactoring and on introducing his own particular coding style, applied on an ongoing basis lesson by lesson the way Level 3 and Sidebars already are. Reflecting on this project's own real experience with lesson drift and his own code drift (see the GameMaker Code-vs-Visual parity ToDo, and the general pattern of naming/structure drift this project has repeatedly caught and fixed via Standards Rules 11-13), he concluded an ongoing Level 4 isn't workable in practice, for a specific, practical reason rather than a philosophical one: it forces a choice, every single lesson, between two options he considers both bad. Option A is making the refactor-to-his-style pass a mandatory part of every lesson going forward, which he explicitly does not want - it would slow lesson production and tie every future lesson to keeping a second code path current. Option B is maintaining two genuinely separate, divergent code bases per lesson - the plain Level 3 solution, and a separately-maintained "Refactored Level 3" - which this project has already experienced is a real, recurring maintenance cost (not a hypothetical one), given how much effort has already gone into catching and fixing drift between a single lesson's own Code and Visual paths within ONE engine, let alone an entirely separate refactored version of every lesson across all 8. His resolution: drop the ongoing-Level-4 idea entirely, and instead write a single, dedicated final chapter - "Doing It the Doers of Stuff Way" (a direct reference to his own studio name) - that does the refactoring discussion once, thoroughly, as its own standalone unit, explicitly outside the 30-lesson weekly cadence. Framed as a take-home capstone-adjacent lecture rather than lesson content proper, with an explicit invitation for students to develop their own coding opinions and style rather than simply adopting his - the chapter teaches the ACT and REASONING of refactoring and personal style as a transferable skill, using Robert's own style as the worked example, not as the prescribed answer.</w:t>
+      </w:r>
+      <w:r>
+        <w:t xml:space="preserve"/>
+      </w:r>
+    </w:p>
+    <w:p>
+      <w:pPr>
+        <w:spacing w:after="200"/>
+      </w:pPr>
+      <w:r>
+        <w:rPr>
+          <w:b/>
+          <w:bCs/>
+          <w:color w:val="1C4A86"/>
+        </w:rPr>
+        <w:t xml:space="preserve">Lesson 12's Option 2 (shared sound-player design) - preserved reasoning for the book version: </w:t>
+      </w:r>
+      <w:r>
+        <w:t xml:space="preserve">Recorded per Robert's explicit instruction, separate from the Option 1 implementation note above: even though Option 1 was chosen for the live course, the shared-sound-player idea the Lesson 12 content had already built (Godot's RoundSound swapping .stream between win/wave/lose clips; Unity's roundAudioSrc with PlayOneShot() layering three clips through one AudioSource) is a genuinely different, and genuinely teachable, architecture - not simply a mistake to discard. The case for reviving it in the book version: (1) it's a real-world pattern working game developers actually use - many shipped games route all short, mutually-exclusive one-shot UI/feedback sounds through a single pooled or shared AudioSource/AudioStreamPlayer rather than one dedicated node per sound, specifically to avoid the node/component count growing linearly with every new sound effect a game ever adds; (2) it's a natural, motivated moment to introduce the concept of a resource (an AudioClip/stream reference) being swapped at runtime rather than fixed at design time, which dedicated per-event nodes never require a student to think about; (3) PlayOneShot() (Unity) and a stream-swap-then-play() (Godot) are each worth teaching in their own right as engine-idiomatic answers to 'how do I play one of several interchangeable sounds from one player,' independent of whether this specific lesson's three sounds (win/wave/lose) technically need it; (4) it would make a clean point of comparison against Scratch and GameMaker's simpler per-branch sound calls, turning the cross-engine contrast itself into a teaching moment ('two valid architectures for the same problem, here's the tradeoff') rather than something to quietly reconcile away. The case against reviving it, for balance: it does contradict the dedicated-per-event pattern Lessons 6 and 8 spent two lessons establishing, so introducing it here reads as a late architecture change rather than a planned progression unless the book's Lesson 6/8 chapters are rewritten to set up the contrast deliberately in advance; it also adds genuine new vocabulary (resource swapping, PlayOneShot's layering semantics vs. .Play()'s replace semantics) in a lesson Robert designed to be lighter than most, which may not fit Lesson 12's intended pacing even in the book. If revived, the clean approach would likely be: keep Lessons 6/8 exactly as the live course now has them (dedicated per-event nodes, Option 1 style), then introduce the shared-player idea in Lesson 12 as a DELIBERATE architectural pivot with its own named rationale ('your game now has four round-ending sounds - here's a different way to organize that'), rather than retroactively implying Lessons 6/8 should have used it from the start. Not decided; purely preserved reasoning for whoever revisits this at book-writing time, per Robert's explicit request to keep it rather than let Option 1's implementation erase the alternative's thinking.</w:t>
+      </w:r>
+      <w:r>
+        <w:t xml:space="preserve"/>
+      </w:r>
+    </w:p>
+    <w:p>
+      <w:pPr>
         <w:pStyle w:val="Heading1"/>
       </w:pPr>
       <w:r>
@@ -2320,7 +2644,7 @@
         <w:spacing w:after="160"/>
       </w:pPr>
       <w:r>
-        <w:t xml:space="preserve">First entry, written the same week as the Unreal Lesson 2/3/4/13 rebuild and the first pass of Cross_Engine_Consistency_Reference.docx. Updated the same week to add Standards Rule 6 (SuperStretch/Refinement and Style/visual-scripting reuse) and scope, but not begin, the question of retrofitting it into Lessons 1-15. Updated again to add Standards Rule 13 (dedicated manager object for shared state), the Lesson 6 GameManager retrofit, and Lesson 7's full compliance pass (GameManager routing, Rule 11 naming-drift fixes, the new Rule 9 diagram set, and Unity Visual Scripting prose tightening). Updated again to add a GameManager mini-lecture to Lesson 7's live slide deck (placed at the start of the lab section, separate from the main lecture) plus the paired ToDo to relocate that discussion to Lecture 06 once the book manuscript reaches it. Updated again to add Lesson 8's own full compliance pass (the lives/has_lost GameManager retrofit, Rule 11/12 TIC-80 and Scratch naming fixes, Rule 7 visual-path explicitness fixes, a new Rule 9 diagram set with a newly-documented Handout-vs-Key placement convention for the three dual-track engines, and the Rule 10/Rule 8 slide deck fixes correcting a Godot-leftover demo reference and adding its first six speaker-notes entries), and to narrow the Rule 7/8/9/13 retrofit ToDo items' remaining scope accordingly. Updated again to add Lesson 9's own full compliance pass (a four-engine Rule 13 GameManager retrofit for score - GameMaker, Scratch, Godot, and Unreal - plus a Rule 11/12 Scratch naming fix, a Rule 7 Unity Visual Scripting explicitness fix, a new Rule 9 diagram set reusing the established Handout-vs-Key placement convention, and the Rule 10/Rule 8 slide deck fixes correcting a Godot-leftover demo reference and adding its six speaker-notes entries), and to narrow the Rule 7/8/9/13 retrofit ToDo items' remaining scope to Lessons 10-15 accordingly. Updated again to record the GameMaker __dnd_lives/__dnd_score correction (Lessons 8-9) and five follow-up To-Do items (Lessons 10-15 review, obj.variable vs. Target drop-down, an If Lives comparison sidebar, GameMaker Prefabs, and dropping asset-name prefixes). Updated again to record the Unity static-members items, the cross-engine name normalization To-Do and the canonical bug-hunt decision, plus the Lesson 10 compliance pass and the cross-engine design-drift To-Do (HUD object, prefabs). Updated again at the Lesson 11 review to point to the new Reflex Habits design-notes document and to record the name "the Stalemate" for the win/lose gap bug and the Lesson 11 compliance pass (active engines only). Updated again to record a spitballed new companion course family - Debugging 101, Testing 101, and a combined Testing/Debugging 201 - raised by Robert as a sideways idea, not yet scoped. Updated again to record the GML Visual "no Else If block" gotcha (not yet audited against shipped content) and to extend Standards Rule 12's scope to cross-engine pop-up/HUD text presentation (centering, placement, size), with reasonable shared defaults proposed but not yet decided or audited. Add to this document as the course continues; do a dedicated consolidation pass every so often rather than continuously.</w:t>
+        <w:t xml:space="preserve">First entry, written the same week as the Unreal Lesson 2/3/4/13 rebuild and the first pass of Cross_Engine_Consistency_Reference.docx. Updated the same week to add Standards Rule 6 (SuperStretch/Refinement and Style/visual-scripting reuse) and scope, but not begin, the question of retrofitting it into Lessons 1-15. Updated again to add Standards Rule 13 (dedicated manager object for shared state), the Lesson 6 GameManager retrofit, and Lesson 7's full compliance pass (GameManager routing, Rule 11 naming-drift fixes, the new Rule 9 diagram set, and Unity Visual Scripting prose tightening). Updated again to add a GameManager mini-lecture to Lesson 7's live slide deck (placed at the start of the lab section, separate from the main lecture) plus the paired ToDo to relocate that discussion to Lecture 06 once the book manuscript reaches it. Updated again to add Lesson 8's own full compliance pass (the lives/has_lost GameManager retrofit, Rule 11/12 TIC-80 and Scratch naming fixes, Rule 7 visual-path explicitness fixes, a new Rule 9 diagram set with a newly-documented Handout-vs-Key placement convention for the three dual-track engines, and the Rule 10/Rule 8 slide deck fixes correcting a Godot-leftover demo reference and adding its first six speaker-notes entries), and to narrow the Rule 7/8/9/13 retrofit ToDo items' remaining scope accordingly. Updated again to add Lesson 9's own full compliance pass (a four-engine Rule 13 GameManager retrofit for score - GameMaker, Scratch, Godot, and Unreal - plus a Rule 11/12 Scratch naming fix, a Rule 7 Unity Visual Scripting explicitness fix, a new Rule 9 diagram set reusing the established Handout-vs-Key placement convention, and the Rule 10/Rule 8 slide deck fixes correcting a Godot-leftover demo reference and adding its six speaker-notes entries), and to narrow the Rule 7/8/9/13 retrofit ToDo items' remaining scope to Lessons 10-15 accordingly. Updated again to record the GameMaker __dnd_lives/__dnd_score correction (Lessons 8-9) and five follow-up To-Do items (Lessons 10-15 review, obj.variable vs. Target drop-down, an If Lives comparison sidebar, GameMaker Prefabs, and dropping asset-name prefixes). Updated again to record the Unity static-members items, the cross-engine name normalization To-Do and the canonical bug-hunt decision, plus the Lesson 10 compliance pass and the cross-engine design-drift To-Do (HUD object, prefabs). Updated again at the Lesson 11 review to point to the new Reflex Habits design-notes document and to record the name "the Stalemate" for the win/lose gap bug and the Lesson 11 compliance pass (active engines only). Updated again to record a spitballed new companion course family - Debugging 101, Testing 101, and a combined Testing/Debugging 201 - raised by Robert as a sideways idea, not yet scoped. Updated again to record the GML Visual "no Else If block" gotcha (not yet audited against shipped content) and to extend Standards Rule 12's scope to cross-engine pop-up/HUD text presentation (centering, placement, size), with reasonable shared defaults proposed but not yet decided or audited. Updated again to record Lesson 12's compliance pass and its genuine sound-architecture conflict (a new shared sound-player design in Godot/Unity contradicting the Lesson 6/8 dedicated-per-event pattern, resolved for the live course as Option 1 - retire the shared player, reuse Lesson 8's sfx_gameover.wav instead of a new sfx_lose.wav asset), plus a separate note preserving Option 2's reasoning (the shared-player design) for reconsideration at book-writing time. Updated again to record Robert's book-retrofit decision to pull all scattered optional sound content out of Lessons 2-8 and consolidate it into a genuinely dedicated Lesson 12 (live course unaffected), plus the sharper Level 1-versus-Level 2 purpose framing it surfaced - Level 1 as a classroom-pacing safety valve, Level 2 as the real preferred target especially for self-paced study - with a leaning that Level 2 goals should exclude sound in the earlier lessons once consolidated. Updated again to record Robert's decision to abandon an ongoing Level 4 (refactoring/personal-style) concept in favor of a single dedicated final chapter, "Doing It the Doers of Stuff Way," delivered outside the 30-lesson cadence as a take-home capstone-adjacent lecture. Updated again to fully scope a new Lesson 15 Complete Codebase deliverable (active 5 engines, Level 3 code included via a Rule 14 backfill, GameMaker Visual represented as full per-object node-flow diagrams rather than prose) - explicitly deferred, not started, until the remaining lessons are reviewed. Updated again to record a GameMaker Lesson 12/wave_cleared() reconciliation note (Level 1 vs. the Lesson 10/11 Level 3 Stalemate-fix architecture), surfaced while Robert reconciled his own drifted GameMaker Script project - explicitly left as-is for now, earmarked for either a later explicit refactor or the planned final refactoring chapter. Updated again to record six candidate refactorings Robert spotted while bringing his own GameMaker project back into compliance (enemy-count self-reporting on Create, a named enemies-per-wave variable instead of a hardcoded count, consolidating enemies_remaining updates onto obj_enemy's Destroy event, moving the lives check off obj_enemy onto the player/manager, extracting player movement into its own script, and eventually retiring obj_spawner once its sole remaining job - a single start_game() call - moves onto obj_gamemanager's own Create event) - captured as raw material for the "Doing It the Doers of Stuff Way" chapter, not implemented now, with obj_spawner's own historical shrinkage across the course flagged as a good real example of incremental refactoring to walk through. Updated again to record a genuine GameMaker naming-drift fix: the drag-and-drop sound block is correctly called "Play Audio" (confirmed by Robert against his own GameMaker install), not "Play Sound"/"Audio Play Sound" as several shipped Lessons 8, 10, 11, and 12 materials had it - corrected across the affected build scripts and reshipped, while Lesson 13's similarly-worded references were checked and confirmed to be 001 Game Creator's and Unreal's own correct, different terminology. Add to this document as the course continues; do a dedicated consolidation pass every so often rather than continuously.</w:t>
       </w:r>
     </w:p>
     <w:sectPr>

</xml_diff>